<commit_message>
Updating the and adding Annexure and POA DM
</commit_message>
<xml_diff>
--- a/templates/SNSGLOBLE/BAHRAIN/afi_noc.docx
+++ b/templates/SNSGLOBLE/BAHRAIN/afi_noc.docx
@@ -425,13 +425,21 @@
         <w:spacing w:after="0" w:line="240" w:lineRule="auto"/>
       </w:pPr>
       <w:r>
-        <w:t>That I am maintaining a register containing the above</w:t>
+        <w:t xml:space="preserve">That I am maintaining a register containing the </w:t>
+      </w:r>
+      <w:proofErr w:type="gramStart"/>
+      <w:r>
+        <w:t>above</w:t>
       </w:r>
       <w:r>
         <w:t xml:space="preserve"> </w:t>
       </w:r>
       <w:r>
-        <w:t>mentioned details of the worker.</w:t>
+        <w:t>mentioned</w:t>
+      </w:r>
+      <w:proofErr w:type="gramEnd"/>
+      <w:r>
+        <w:t xml:space="preserve"> details of the worker.</w:t>
       </w:r>
     </w:p>
     <w:p>
@@ -498,7 +506,15 @@
         <w:t xml:space="preserve">of and undertake that in the event of any </w:t>
       </w:r>
       <w:r>
-        <w:t>of the documents field along with or</w:t>
+        <w:t xml:space="preserve">of the </w:t>
+      </w:r>
+      <w:proofErr w:type="gramStart"/>
+      <w:r>
+        <w:t>documents</w:t>
+      </w:r>
+      <w:proofErr w:type="gramEnd"/>
+      <w:r>
+        <w:t xml:space="preserve"> field along with or</w:t>
       </w:r>
     </w:p>
     <w:p>
@@ -604,7 +620,15 @@
         <w:t>practices</w:t>
       </w:r>
       <w:r>
-        <w:t xml:space="preserve">, do’s and don’ts in the country of the emigration have been    </w:t>
+        <w:t xml:space="preserve">, </w:t>
+      </w:r>
+      <w:proofErr w:type="gramStart"/>
+      <w:r>
+        <w:t>do’s</w:t>
+      </w:r>
+      <w:proofErr w:type="gramEnd"/>
+      <w:r>
+        <w:t xml:space="preserve"> and don’ts in the country of the emigration have been    </w:t>
       </w:r>
     </w:p>
     <w:p>
@@ -1075,6 +1099,7 @@
       <w:r>
         <w:t>er OM of 03</w:t>
       </w:r>
+      <w:proofErr w:type="gramStart"/>
       <w:r>
         <w:rPr>
           <w:vertAlign w:val="superscript"/>
@@ -1082,8 +1107,13 @@
         <w:t>rd</w:t>
       </w:r>
       <w:r>
-        <w:t xml:space="preserve">  August 2018 and 02</w:t>
-      </w:r>
+        <w:t xml:space="preserve">  August</w:t>
+      </w:r>
+      <w:proofErr w:type="gramEnd"/>
+      <w:r>
+        <w:t xml:space="preserve"> 2018 and 02</w:t>
+      </w:r>
+      <w:proofErr w:type="gramStart"/>
       <w:r>
         <w:rPr>
           <w:vertAlign w:val="superscript"/>
@@ -1094,7 +1124,11 @@
         <w:t xml:space="preserve">  J</w:t>
       </w:r>
       <w:r>
-        <w:t>une 2021 with the same FE</w:t>
+        <w:t>une</w:t>
+      </w:r>
+      <w:proofErr w:type="gramEnd"/>
+      <w:r>
+        <w:t xml:space="preserve"> 2021 with the same FE</w:t>
       </w:r>
       <w:r>
         <w:t>.</w:t>
@@ -1329,10 +1363,18 @@
         <w:spacing w:after="0" w:line="240" w:lineRule="auto"/>
       </w:pPr>
       <w:r>
-        <w:t>That, W</w:t>
-      </w:r>
-      <w:r>
-        <w:t>e will also issue the PBBY policy of the emigrant and will co-operate/help the emigrant/family if any claim is required in future.</w:t>
+        <w:t xml:space="preserve">That, </w:t>
+      </w:r>
+      <w:proofErr w:type="gramStart"/>
+      <w:r>
+        <w:t>W</w:t>
+      </w:r>
+      <w:r>
+        <w:t>e</w:t>
+      </w:r>
+      <w:proofErr w:type="gramEnd"/>
+      <w:r>
+        <w:t xml:space="preserve"> will also issue the PBBY policy of the emigrant and will co-operate/help the emigrant/family if any claim is required in future.</w:t>
       </w:r>
     </w:p>
     <w:p>
@@ -1957,7 +1999,15 @@
         <w:spacing w:after="0" w:line="240" w:lineRule="auto"/>
       </w:pPr>
       <w:r>
-        <w:t>Verified that the content of the above affidavit are true and correct to the best of my knowledge and belief and nothing has been concealed there from.</w:t>
+        <w:t xml:space="preserve">Verified that the content of the above affidavit </w:t>
+      </w:r>
+      <w:proofErr w:type="gramStart"/>
+      <w:r>
+        <w:t>are</w:t>
+      </w:r>
+      <w:proofErr w:type="gramEnd"/>
+      <w:r>
+        <w:t xml:space="preserve"> true and correct to the best of my knowledge and belief and nothing has been concealed there from.</w:t>
       </w:r>
     </w:p>
     <w:p>
@@ -3162,6 +3212,48 @@
           <w:szCs w:val="24"/>
         </w:rPr>
       </w:pPr>
+      <w:r>
+        <w:rPr>
+          <w:rFonts w:eastAsia="Times New Roman" w:cstheme="minorHAnsi"/>
+          <w:noProof/>
+          <w:szCs w:val="24"/>
+        </w:rPr>
+        <w:pict w14:anchorId="66949239">
+          <v:rect id="_x0000_s2053" style="position:absolute;margin-left:-3.45pt;margin-top:5.2pt;width:125.05pt;height:69.2pt;z-index:251672576">
+            <v:textbox>
+              <w:txbxContent>
+                <w:p>
+                  <w:proofErr w:type="spellStart"/>
+                  <w:r>
+                    <w:t>BoarderBoX</w:t>
+                  </w:r>
+                  <w:proofErr w:type="spellEnd"/>
+                </w:p>
+              </w:txbxContent>
+            </v:textbox>
+          </v:rect>
+        </w:pict>
+      </w:r>
+      <w:r>
+        <w:rPr>
+          <w:rFonts w:eastAsia="Times New Roman" w:cstheme="minorHAnsi"/>
+          <w:noProof/>
+          <w:szCs w:val="24"/>
+        </w:rPr>
+        <w:pict w14:anchorId="174E44D0">
+          <v:rect id="_x0000_s2054" style="position:absolute;margin-left:13.8pt;margin-top:26.55pt;width:81.95pt;height:39.4pt;rotation:-151567fd;z-index:251673600;mso-position-horizontal-relative:text;mso-position-vertical-relative:text" fillcolor="#4f81bd [3204]" stroked="f">
+            <v:textbox>
+              <w:txbxContent>
+                <w:p>
+                  <w:r>
+                    <w:t>{{EMPLOYEE_SIGNATURE}}</w:t>
+                  </w:r>
+                </w:p>
+              </w:txbxContent>
+            </v:textbox>
+          </v:rect>
+        </w:pict>
+      </w:r>
     </w:p>
     <w:p>
       <w:pPr>

</xml_diff>